<commit_message>
docs: add reproducible research report export
</commit_message>
<xml_diff>
--- a/deliverables/研究报告_20261023/决策不确定性及其来源的分析-分类-量化方法_研究报告_20261023.docx
+++ b/deliverables/研究报告_20261023/决策不确定性及其来源的分析-分类-量化方法_研究报告_20261023.docx
@@ -2,7 +2,7 @@
 <file path=word/document.xml><?xml version="1.0" encoding="utf-8"?>
 <w:document xmlns:w="http://schemas.openxmlformats.org/wordprocessingml/2006/main" xmlns:m="http://schemas.openxmlformats.org/officeDocument/2006/math" xmlns:r="http://schemas.openxmlformats.org/officeDocument/2006/relationships" xmlns:o="urn:schemas-microsoft-com:office:office" xmlns:v="urn:schemas-microsoft-com:vml" xmlns:w10="urn:schemas-microsoft-com:office:word" xmlns:a="http://schemas.openxmlformats.org/drawingml/2006/main" xmlns:pic="http://schemas.openxmlformats.org/drawingml/2006/picture" xmlns:wp="http://schemas.openxmlformats.org/drawingml/2006/wordprocessingDrawing">
   <w:body>
-    <w:bookmarkStart w:id="80" w:name="决策不确定性及其来源的分析-分类-量化方法研究报告"/>
+    <w:bookmarkStart w:id="72" w:name="决策不确定性及其来源的分析-分类-量化方法研究报告"/>
     <w:p>
       <w:pPr>
         <w:pStyle w:val="Title"/>
@@ -271,7 +271,7 @@
         <w:rPr>
           <w:rFonts w:hint="eastAsia"/>
         </w:rPr>
-        <w:t xml:space="preserve">本项目以大模型驱动的代码生成为主要观察载体，将需求文本视为输入条件、任务计划视为中间决策、代码与测试结果视为输出及反馈。研究关注三个问题：不确定性可能在哪个环节产生，哪些数据能够观察其表现，以及如何把观测量转为可调用的指标和有明确条件的规则。检索与工具调用可沿用相同记录方式，具体方法见配套《智能软件决策多元不确定性主动感知方法研究报告》。</w:t>
+        <w:t xml:space="preserve">本项目以大模型驱动的代码生成为主要观察载体，将需求文本视为输入条件、任务计划视为中间决策、代码与测试结果视为输出及反馈。研究关注三个问题：不确定性可能在哪个环节产生，哪些数据能够观察其表现，以及如何把观测量转为可调用的指标和有明确条件的规则。检索与工具调用可沿用相同记录方式，分别记录输入信息、决策依据、执行动作与反馈结果。</w:t>
       </w:r>
     </w:p>
     <w:p>
@@ -407,16 +407,25 @@
         <w:rPr>
           <w:rFonts w:hint="eastAsia"/>
         </w:rPr>
-        <w:t xml:space="preserve">条目名称、输入输出与成熟度与项目展示目录一致[6]，PlanCoder</w:t>
-      </w:r>
-      <w:r>
-        <w:t xml:space="preserve"> </w:t>
-      </w:r>
-      <w:r>
-        <w:rPr>
-          <w:rFonts w:hint="eastAsia"/>
-        </w:rPr>
-        <w:t xml:space="preserve">的研究定义和实验结论依据计划质量研究论文[5]，相关数据与结果通过归档资料追溯[7,8]。函数实现用于说明计算约定和接口行为。合成算例用于演示计算过程，实验统计按论文或归档记录引用，并在正文与表题中标明来源。</w:t>
+        <w:t xml:space="preserve">本报告直接给出各条目的名称、输入输出、计算约定和接口行为。PlanCoder</w:t>
+      </w:r>
+      <w:r>
+        <w:t xml:space="preserve"> </w:t>
+      </w:r>
+      <w:r>
+        <w:rPr>
+          <w:rFonts w:hint="eastAsia"/>
+        </w:rPr>
+        <w:t xml:space="preserve">的研究定义和实验结论依据计划质量研究论文[5]；PULSE</w:t>
+      </w:r>
+      <w:r>
+        <w:t xml:space="preserve"> </w:t>
+      </w:r>
+      <w:r>
+        <w:rPr>
+          <w:rFonts w:hint="eastAsia"/>
+        </w:rPr>
+        <w:t xml:space="preserve">的实验设置、样本规模和统计结果在第五章说明。合成算例用于演示计算过程，实验统计分别注明本项目实验结果或论文报告值。</w:t>
       </w:r>
     </w:p>
     <w:bookmarkEnd w:id="12"/>
@@ -449,7 +458,7 @@
         <w:rPr>
           <w:rFonts w:hint="eastAsia"/>
         </w:rPr>
-        <w:t xml:space="preserve">分类工作按“通用来源梳理—代码生成场景分析—框架整合—指标设计与验证”组织。首先结合历史实施方案辨析信息不完备、模型偏差和生成随机性等共性来源；随后按需求端、规划端和执行端分析场景特有表现，建立端侧与来源的对应关系；最后用可复算指标和受控实验检验部分分类的可观测性。系统性文献检索与项目级类别全集的完善列为后续研究工作。</w:t>
+        <w:t xml:space="preserve">分类工作按“通用来源梳理—代码生成场景分析—框架整合—指标设计与验证”组织。首先辨析信息不完备、模型偏差和生成随机性等共性来源；随后按需求端、规划端和执行端分析场景特有表现，建立端侧与来源的对应关系；最后用可复算指标和受控实验检验部分分类的可观测性。系统性文献检索与项目级类别全集的完善列为后续研究工作。</w:t>
       </w:r>
     </w:p>
     <w:bookmarkStart w:id="14" w:name="概念与分析单元"/>
@@ -1197,7 +1206,7 @@
         <w:rPr>
           <w:rFonts w:hint="eastAsia"/>
         </w:rPr>
-        <w:t xml:space="preserve">对跨环节关系，只在同一基础任务、相同测试版本和可比较的生成配置下讨论变化。若需求和计划同时改变，就无法仅凭最终正确率判断哪一端起主要作用；需要配对条件、受控扰动或额外复核。历史方案提出的传播拓扑和强度量化，为后续研究提供结构目标；目前尚未形成同任务的需求端与规划端联合全过程数据，因此本报告只给出可检验的路径描述和记录接口，不给出已验证的因果传播系数。</w:t>
+        <w:t xml:space="preserve">对跨环节关系，只在同一基础任务、相同测试版本和可比较的生成配置下讨论变化。若需求和计划同时改变，就无法仅凭最终正确率判断哪一端起主要作用；需要配对条件、受控扰动或额外复核。后续研究可进一步建立传播拓扑并量化传播强度；目前尚未形成同任务的需求端与规划端联合全过程数据，因此本报告只给出可检验的路径描述和记录接口，不给出已验证的因果传播系数。</w:t>
       </w:r>
     </w:p>
     <w:bookmarkEnd w:id="18"/>
@@ -2202,7 +2211,7 @@
         <w:rPr>
           <w:rFonts w:hint="eastAsia"/>
         </w:rPr>
-        <w:t xml:space="preserve">本章依据当前展示页面逐项说明十二项指标，编号、名称与目录一致[6]。PULSE</w:t>
+        <w:t xml:space="preserve">本章逐项说明十二项指标的定义、输入和计算方法。PULSE</w:t>
       </w:r>
       <w:r>
         <w:t xml:space="preserve"> </w:t>
@@ -2220,34 +2229,7 @@
         <w:rPr>
           <w:rFonts w:hint="eastAsia"/>
         </w:rPr>
-        <w:t xml:space="preserve">指标观察计划质量及生成结果的稳定性。A</w:t>
-      </w:r>
-      <w:r>
-        <w:t xml:space="preserve"> </w:t>
-      </w:r>
-      <w:r>
-        <w:rPr>
-          <w:rFonts w:hint="eastAsia"/>
-        </w:rPr>
-        <w:t xml:space="preserve">表示“实现与记录”，B</w:t>
-      </w:r>
-      <w:r>
-        <w:t xml:space="preserve"> </w:t>
-      </w:r>
-      <w:r>
-        <w:rPr>
-          <w:rFonts w:hint="eastAsia"/>
-        </w:rPr>
-        <w:t xml:space="preserve">表示“待独立验证”，C</w:t>
-      </w:r>
-      <w:r>
-        <w:t xml:space="preserve"> </w:t>
-      </w:r>
-      <w:r>
-        <w:rPr>
-          <w:rFonts w:hint="eastAsia"/>
-        </w:rPr>
-        <w:t xml:space="preserve">表示“机制候选”；这是页面成熟度标记，独立条目认定另见第六章。</w:t>
+        <w:t xml:space="preserve">指标观察计划质量及生成结果的稳定性。独立条目认定见第六章。</w:t>
       </w:r>
     </w:p>
     <w:tbl>
@@ -2272,11 +2254,10 @@
         </w:tblCellMar>
       </w:tblPr>
       <w:tblGrid>
-        <w:gridCol w:w="1711"/>
-        <w:gridCol w:w="2518"/>
-        <w:gridCol w:w="1711"/>
-        <w:gridCol w:w="1711"/>
-        <w:gridCol w:w="1709"/>
+        <w:gridCol w:w="2093"/>
+        <w:gridCol w:w="3081"/>
+        <w:gridCol w:w="2093"/>
+        <w:gridCol w:w="2093"/>
       </w:tblGrid>
       <w:tr>
         <w:trPr>
@@ -2284,7 +2265,7 @@
         </w:trPr>
         <w:tc>
           <w:tcPr>
-            <w:tcW w:w="1711" w:type="dxa"/>
+            <w:tcW w:w="2093" w:type="dxa"/>
             <w:vAlign w:val="center"/>
             <w:shd w:val="clear" w:fill="EDEDED"/>
           </w:tcPr>
@@ -2308,7 +2289,7 @@
         </w:tc>
         <w:tc>
           <w:tcPr>
-            <w:tcW w:w="2518" w:type="dxa"/>
+            <w:tcW w:w="3081" w:type="dxa"/>
             <w:vAlign w:val="center"/>
             <w:shd w:val="clear" w:fill="EDEDED"/>
           </w:tcPr>
@@ -2326,13 +2307,13 @@
                 <w:szCs w:val="21"/>
                 <w:b w:val="1"/>
               </w:rPr>
-              <w:t xml:space="preserve">页面名称</w:t>
-            </w:r>
-          </w:p>
-        </w:tc>
-        <w:tc>
-          <w:tcPr>
-            <w:tcW w:w="1711" w:type="dxa"/>
+              <w:t xml:space="preserve">指标名称</w:t>
+            </w:r>
+          </w:p>
+        </w:tc>
+        <w:tc>
+          <w:tcPr>
+            <w:tcW w:w="2093" w:type="dxa"/>
             <w:vAlign w:val="center"/>
             <w:shd w:val="clear" w:fill="EDEDED"/>
           </w:tcPr>
@@ -2356,7 +2337,7 @@
         </w:tc>
         <w:tc>
           <w:tcPr>
-            <w:tcW w:w="1711" w:type="dxa"/>
+            <w:tcW w:w="2093" w:type="dxa"/>
             <w:vAlign w:val="center"/>
             <w:shd w:val="clear" w:fill="EDEDED"/>
           </w:tcPr>
@@ -2375,30 +2356,6 @@
                 <w:b w:val="1"/>
               </w:rPr>
               <w:t xml:space="preserve">范围</w:t>
-            </w:r>
-          </w:p>
-        </w:tc>
-        <w:tc>
-          <w:tcPr>
-            <w:tcW w:w="1709" w:type="dxa"/>
-            <w:vAlign w:val="center"/>
-            <w:shd w:val="clear" w:fill="EDEDED"/>
-          </w:tcPr>
-          <w:p>
-            <w:pPr>
-              <w:pStyle w:val="Compact"/>
-              <w:spacing w:before="0" w:after="0" w:line="360" w:lineRule="auto"/>
-              <w:ind w:firstLineChars="0"/>
-              <w:jc w:val="center"/>
-            </w:pPr>
-            <w:r>
-              <w:rPr>
-                <w:rFonts w:hint="eastAsia" w:ascii="Times New Roman" w:hAnsi="Times New Roman" w:cs="Times New Roman" w:eastAsia="宋体"/>
-                <w:sz w:val="21"/>
-                <w:szCs w:val="21"/>
-                <w:b w:val="1"/>
-              </w:rPr>
-              <w:t xml:space="preserve">状态</w:t>
             </w:r>
           </w:p>
         </w:tc>
@@ -2406,7 +2363,7 @@
       <w:tr>
         <w:tc>
           <w:tcPr>
-            <w:tcW w:w="1711" w:type="dxa"/>
+            <w:tcW w:w="2093" w:type="dxa"/>
             <w:vAlign w:val="center"/>
           </w:tcPr>
           <w:p>
@@ -2428,7 +2385,7 @@
         </w:tc>
         <w:tc>
           <w:tcPr>
-            <w:tcW w:w="2518" w:type="dxa"/>
+            <w:tcW w:w="3081" w:type="dxa"/>
             <w:vAlign w:val="center"/>
           </w:tcPr>
           <w:p>
@@ -2450,7 +2407,7 @@
         </w:tc>
         <w:tc>
           <w:tcPr>
-            <w:tcW w:w="1711" w:type="dxa"/>
+            <w:tcW w:w="2093" w:type="dxa"/>
             <w:vAlign w:val="center"/>
           </w:tcPr>
           <w:p>
@@ -2472,7 +2429,7 @@
         </w:tc>
         <w:tc>
           <w:tcPr>
-            <w:tcW w:w="1711" w:type="dxa"/>
+            <w:tcW w:w="2093" w:type="dxa"/>
             <w:vAlign w:val="center"/>
           </w:tcPr>
           <w:p>
@@ -2489,28 +2446,6 @@
                 <w:szCs w:val="21"/>
               </w:rPr>
               <w:t xml:space="preserve">[0,1]</w:t>
-            </w:r>
-          </w:p>
-        </w:tc>
-        <w:tc>
-          <w:tcPr>
-            <w:tcW w:w="1709" w:type="dxa"/>
-            <w:vAlign w:val="center"/>
-          </w:tcPr>
-          <w:p>
-            <w:pPr>
-              <w:pStyle w:val="Compact"/>
-              <w:spacing w:before="0" w:after="0" w:line="360" w:lineRule="auto"/>
-              <w:ind w:firstLineChars="0"/>
-              <w:jc w:val="left"/>
-            </w:pPr>
-            <w:r>
-              <w:rPr>
-                <w:rFonts w:ascii="Times New Roman" w:hAnsi="Times New Roman" w:cs="Times New Roman" w:eastAsia="宋体"/>
-                <w:sz w:val="21"/>
-                <w:szCs w:val="21"/>
-              </w:rPr>
-              <w:t xml:space="preserve">A</w:t>
             </w:r>
           </w:p>
         </w:tc>
@@ -2518,7 +2453,7 @@
       <w:tr>
         <w:tc>
           <w:tcPr>
-            <w:tcW w:w="1711" w:type="dxa"/>
+            <w:tcW w:w="2093" w:type="dxa"/>
             <w:vAlign w:val="center"/>
           </w:tcPr>
           <w:p>
@@ -2540,7 +2475,7 @@
         </w:tc>
         <w:tc>
           <w:tcPr>
-            <w:tcW w:w="2518" w:type="dxa"/>
+            <w:tcW w:w="3081" w:type="dxa"/>
             <w:vAlign w:val="center"/>
           </w:tcPr>
           <w:p>
@@ -2562,7 +2497,7 @@
         </w:tc>
         <w:tc>
           <w:tcPr>
-            <w:tcW w:w="1711" w:type="dxa"/>
+            <w:tcW w:w="2093" w:type="dxa"/>
             <w:vAlign w:val="center"/>
           </w:tcPr>
           <w:p>
@@ -2584,7 +2519,7 @@
         </w:tc>
         <w:tc>
           <w:tcPr>
-            <w:tcW w:w="1711" w:type="dxa"/>
+            <w:tcW w:w="2093" w:type="dxa"/>
             <w:vAlign w:val="center"/>
           </w:tcPr>
           <w:p>
@@ -2601,28 +2536,6 @@
                 <w:szCs w:val="21"/>
               </w:rPr>
               <w:t xml:space="preserve">[0,1]</w:t>
-            </w:r>
-          </w:p>
-        </w:tc>
-        <w:tc>
-          <w:tcPr>
-            <w:tcW w:w="1709" w:type="dxa"/>
-            <w:vAlign w:val="center"/>
-          </w:tcPr>
-          <w:p>
-            <w:pPr>
-              <w:pStyle w:val="Compact"/>
-              <w:spacing w:before="0" w:after="0" w:line="360" w:lineRule="auto"/>
-              <w:ind w:firstLineChars="0"/>
-              <w:jc w:val="left"/>
-            </w:pPr>
-            <w:r>
-              <w:rPr>
-                <w:rFonts w:ascii="Times New Roman" w:hAnsi="Times New Roman" w:cs="Times New Roman" w:eastAsia="宋体"/>
-                <w:sz w:val="21"/>
-                <w:szCs w:val="21"/>
-              </w:rPr>
-              <w:t xml:space="preserve">A</w:t>
             </w:r>
           </w:p>
         </w:tc>
@@ -2630,7 +2543,7 @@
       <w:tr>
         <w:tc>
           <w:tcPr>
-            <w:tcW w:w="1711" w:type="dxa"/>
+            <w:tcW w:w="2093" w:type="dxa"/>
             <w:vAlign w:val="center"/>
           </w:tcPr>
           <w:p>
@@ -2652,7 +2565,7 @@
         </w:tc>
         <w:tc>
           <w:tcPr>
-            <w:tcW w:w="2518" w:type="dxa"/>
+            <w:tcW w:w="3081" w:type="dxa"/>
             <w:vAlign w:val="center"/>
           </w:tcPr>
           <w:p>
@@ -2674,7 +2587,7 @@
         </w:tc>
         <w:tc>
           <w:tcPr>
-            <w:tcW w:w="1711" w:type="dxa"/>
+            <w:tcW w:w="2093" w:type="dxa"/>
             <w:vAlign w:val="center"/>
           </w:tcPr>
           <w:p>
@@ -2696,7 +2609,7 @@
         </w:tc>
         <w:tc>
           <w:tcPr>
-            <w:tcW w:w="1711" w:type="dxa"/>
+            <w:tcW w:w="2093" w:type="dxa"/>
             <w:vAlign w:val="center"/>
           </w:tcPr>
           <w:p>
@@ -2713,28 +2626,6 @@
                 <w:szCs w:val="21"/>
               </w:rPr>
               <w:t xml:space="preserve">[0,1]</w:t>
-            </w:r>
-          </w:p>
-        </w:tc>
-        <w:tc>
-          <w:tcPr>
-            <w:tcW w:w="1709" w:type="dxa"/>
-            <w:vAlign w:val="center"/>
-          </w:tcPr>
-          <w:p>
-            <w:pPr>
-              <w:pStyle w:val="Compact"/>
-              <w:spacing w:before="0" w:after="0" w:line="360" w:lineRule="auto"/>
-              <w:ind w:firstLineChars="0"/>
-              <w:jc w:val="left"/>
-            </w:pPr>
-            <w:r>
-              <w:rPr>
-                <w:rFonts w:ascii="Times New Roman" w:hAnsi="Times New Roman" w:cs="Times New Roman" w:eastAsia="宋体"/>
-                <w:sz w:val="21"/>
-                <w:szCs w:val="21"/>
-              </w:rPr>
-              <w:t xml:space="preserve">A</w:t>
             </w:r>
           </w:p>
         </w:tc>
@@ -2742,7 +2633,7 @@
       <w:tr>
         <w:tc>
           <w:tcPr>
-            <w:tcW w:w="1711" w:type="dxa"/>
+            <w:tcW w:w="2093" w:type="dxa"/>
             <w:vAlign w:val="center"/>
           </w:tcPr>
           <w:p>
@@ -2764,7 +2655,7 @@
         </w:tc>
         <w:tc>
           <w:tcPr>
-            <w:tcW w:w="2518" w:type="dxa"/>
+            <w:tcW w:w="3081" w:type="dxa"/>
             <w:vAlign w:val="center"/>
           </w:tcPr>
           <w:p>
@@ -2786,7 +2677,7 @@
         </w:tc>
         <w:tc>
           <w:tcPr>
-            <w:tcW w:w="1711" w:type="dxa"/>
+            <w:tcW w:w="2093" w:type="dxa"/>
             <w:vAlign w:val="center"/>
           </w:tcPr>
           <w:p>
@@ -2808,7 +2699,7 @@
         </w:tc>
         <w:tc>
           <w:tcPr>
-            <w:tcW w:w="1711" w:type="dxa"/>
+            <w:tcW w:w="2093" w:type="dxa"/>
             <w:vAlign w:val="center"/>
           </w:tcPr>
           <w:p>
@@ -2825,28 +2716,6 @@
                 <w:szCs w:val="21"/>
               </w:rPr>
               <w:t xml:space="preserve">[0,1]</w:t>
-            </w:r>
-          </w:p>
-        </w:tc>
-        <w:tc>
-          <w:tcPr>
-            <w:tcW w:w="1709" w:type="dxa"/>
-            <w:vAlign w:val="center"/>
-          </w:tcPr>
-          <w:p>
-            <w:pPr>
-              <w:pStyle w:val="Compact"/>
-              <w:spacing w:before="0" w:after="0" w:line="360" w:lineRule="auto"/>
-              <w:ind w:firstLineChars="0"/>
-              <w:jc w:val="left"/>
-            </w:pPr>
-            <w:r>
-              <w:rPr>
-                <w:rFonts w:ascii="Times New Roman" w:hAnsi="Times New Roman" w:cs="Times New Roman" w:eastAsia="宋体"/>
-                <w:sz w:val="21"/>
-                <w:szCs w:val="21"/>
-              </w:rPr>
-              <w:t xml:space="preserve">B</w:t>
             </w:r>
           </w:p>
         </w:tc>
@@ -2854,7 +2723,7 @@
       <w:tr>
         <w:tc>
           <w:tcPr>
-            <w:tcW w:w="1711" w:type="dxa"/>
+            <w:tcW w:w="2093" w:type="dxa"/>
             <w:vAlign w:val="center"/>
           </w:tcPr>
           <w:p>
@@ -2876,7 +2745,7 @@
         </w:tc>
         <w:tc>
           <w:tcPr>
-            <w:tcW w:w="2518" w:type="dxa"/>
+            <w:tcW w:w="3081" w:type="dxa"/>
             <w:vAlign w:val="center"/>
           </w:tcPr>
           <w:p>
@@ -2898,7 +2767,7 @@
         </w:tc>
         <w:tc>
           <w:tcPr>
-            <w:tcW w:w="1711" w:type="dxa"/>
+            <w:tcW w:w="2093" w:type="dxa"/>
             <w:vAlign w:val="center"/>
           </w:tcPr>
           <w:p>
@@ -2920,7 +2789,7 @@
         </w:tc>
         <w:tc>
           <w:tcPr>
-            <w:tcW w:w="1711" w:type="dxa"/>
+            <w:tcW w:w="2093" w:type="dxa"/>
             <w:vAlign w:val="center"/>
           </w:tcPr>
           <w:p>
@@ -2937,28 +2806,6 @@
                 <w:szCs w:val="21"/>
               </w:rPr>
               <w:t xml:space="preserve">[0,1] bit</w:t>
-            </w:r>
-          </w:p>
-        </w:tc>
-        <w:tc>
-          <w:tcPr>
-            <w:tcW w:w="1709" w:type="dxa"/>
-            <w:vAlign w:val="center"/>
-          </w:tcPr>
-          <w:p>
-            <w:pPr>
-              <w:pStyle w:val="Compact"/>
-              <w:spacing w:before="0" w:after="0" w:line="360" w:lineRule="auto"/>
-              <w:ind w:firstLineChars="0"/>
-              <w:jc w:val="left"/>
-            </w:pPr>
-            <w:r>
-              <w:rPr>
-                <w:rFonts w:ascii="Times New Roman" w:hAnsi="Times New Roman" w:cs="Times New Roman" w:eastAsia="宋体"/>
-                <w:sz w:val="21"/>
-                <w:szCs w:val="21"/>
-              </w:rPr>
-              <w:t xml:space="preserve">B</w:t>
             </w:r>
           </w:p>
         </w:tc>
@@ -2966,7 +2813,7 @@
       <w:tr>
         <w:tc>
           <w:tcPr>
-            <w:tcW w:w="1711" w:type="dxa"/>
+            <w:tcW w:w="2093" w:type="dxa"/>
             <w:vAlign w:val="center"/>
           </w:tcPr>
           <w:p>
@@ -2988,7 +2835,7 @@
         </w:tc>
         <w:tc>
           <w:tcPr>
-            <w:tcW w:w="2518" w:type="dxa"/>
+            <w:tcW w:w="3081" w:type="dxa"/>
             <w:vAlign w:val="center"/>
           </w:tcPr>
           <w:p>
@@ -3010,7 +2857,7 @@
         </w:tc>
         <w:tc>
           <w:tcPr>
-            <w:tcW w:w="1711" w:type="dxa"/>
+            <w:tcW w:w="2093" w:type="dxa"/>
             <w:vAlign w:val="center"/>
           </w:tcPr>
           <w:p>
@@ -3032,7 +2879,7 @@
         </w:tc>
         <w:tc>
           <w:tcPr>
-            <w:tcW w:w="1711" w:type="dxa"/>
+            <w:tcW w:w="2093" w:type="dxa"/>
             <w:vAlign w:val="center"/>
           </w:tcPr>
           <w:p>
@@ -3049,28 +2896,6 @@
                 <w:szCs w:val="21"/>
               </w:rPr>
               <w:t xml:space="preserve">[0,0.25]</w:t>
-            </w:r>
-          </w:p>
-        </w:tc>
-        <w:tc>
-          <w:tcPr>
-            <w:tcW w:w="1709" w:type="dxa"/>
-            <w:vAlign w:val="center"/>
-          </w:tcPr>
-          <w:p>
-            <w:pPr>
-              <w:pStyle w:val="Compact"/>
-              <w:spacing w:before="0" w:after="0" w:line="360" w:lineRule="auto"/>
-              <w:ind w:firstLineChars="0"/>
-              <w:jc w:val="left"/>
-            </w:pPr>
-            <w:r>
-              <w:rPr>
-                <w:rFonts w:ascii="Times New Roman" w:hAnsi="Times New Roman" w:cs="Times New Roman" w:eastAsia="宋体"/>
-                <w:sz w:val="21"/>
-                <w:szCs w:val="21"/>
-              </w:rPr>
-              <w:t xml:space="preserve">B</w:t>
             </w:r>
           </w:p>
         </w:tc>
@@ -3078,7 +2903,7 @@
       <w:tr>
         <w:tc>
           <w:tcPr>
-            <w:tcW w:w="1711" w:type="dxa"/>
+            <w:tcW w:w="2093" w:type="dxa"/>
             <w:vAlign w:val="center"/>
           </w:tcPr>
           <w:p>
@@ -3100,7 +2925,7 @@
         </w:tc>
         <w:tc>
           <w:tcPr>
-            <w:tcW w:w="2518" w:type="dxa"/>
+            <w:tcW w:w="3081" w:type="dxa"/>
             <w:vAlign w:val="center"/>
           </w:tcPr>
           <w:p>
@@ -3122,7 +2947,7 @@
         </w:tc>
         <w:tc>
           <w:tcPr>
-            <w:tcW w:w="1711" w:type="dxa"/>
+            <w:tcW w:w="2093" w:type="dxa"/>
             <w:vAlign w:val="center"/>
           </w:tcPr>
           <w:p>
@@ -3144,7 +2969,7 @@
         </w:tc>
         <w:tc>
           <w:tcPr>
-            <w:tcW w:w="1711" w:type="dxa"/>
+            <w:tcW w:w="2093" w:type="dxa"/>
             <w:vAlign w:val="center"/>
           </w:tcPr>
           <w:p>
@@ -3161,28 +2986,6 @@
                 <w:szCs w:val="21"/>
               </w:rPr>
               <w:t xml:space="preserve">[1/K,1]</w:t>
-            </w:r>
-          </w:p>
-        </w:tc>
-        <w:tc>
-          <w:tcPr>
-            <w:tcW w:w="1709" w:type="dxa"/>
-            <w:vAlign w:val="center"/>
-          </w:tcPr>
-          <w:p>
-            <w:pPr>
-              <w:pStyle w:val="Compact"/>
-              <w:spacing w:before="0" w:after="0" w:line="360" w:lineRule="auto"/>
-              <w:ind w:firstLineChars="0"/>
-              <w:jc w:val="left"/>
-            </w:pPr>
-            <w:r>
-              <w:rPr>
-                <w:rFonts w:ascii="Times New Roman" w:hAnsi="Times New Roman" w:cs="Times New Roman" w:eastAsia="宋体"/>
-                <w:sz w:val="21"/>
-                <w:szCs w:val="21"/>
-              </w:rPr>
-              <w:t xml:space="preserve">B</w:t>
             </w:r>
           </w:p>
         </w:tc>
@@ -3190,7 +2993,7 @@
       <w:tr>
         <w:tc>
           <w:tcPr>
-            <w:tcW w:w="1711" w:type="dxa"/>
+            <w:tcW w:w="2093" w:type="dxa"/>
             <w:vAlign w:val="center"/>
           </w:tcPr>
           <w:p>
@@ -3212,7 +3015,7 @@
         </w:tc>
         <w:tc>
           <w:tcPr>
-            <w:tcW w:w="2518" w:type="dxa"/>
+            <w:tcW w:w="3081" w:type="dxa"/>
             <w:vAlign w:val="center"/>
           </w:tcPr>
           <w:p>
@@ -3234,7 +3037,7 @@
         </w:tc>
         <w:tc>
           <w:tcPr>
-            <w:tcW w:w="1711" w:type="dxa"/>
+            <w:tcW w:w="2093" w:type="dxa"/>
             <w:vAlign w:val="center"/>
           </w:tcPr>
           <w:p>
@@ -3256,7 +3059,7 @@
         </w:tc>
         <w:tc>
           <w:tcPr>
-            <w:tcW w:w="1711" w:type="dxa"/>
+            <w:tcW w:w="2093" w:type="dxa"/>
             <w:vAlign w:val="center"/>
           </w:tcPr>
           <w:p>
@@ -3273,28 +3076,6 @@
                 <w:szCs w:val="21"/>
               </w:rPr>
               <w:t xml:space="preserve">[-1,1]</w:t>
-            </w:r>
-          </w:p>
-        </w:tc>
-        <w:tc>
-          <w:tcPr>
-            <w:tcW w:w="1709" w:type="dxa"/>
-            <w:vAlign w:val="center"/>
-          </w:tcPr>
-          <w:p>
-            <w:pPr>
-              <w:pStyle w:val="Compact"/>
-              <w:spacing w:before="0" w:after="0" w:line="360" w:lineRule="auto"/>
-              <w:ind w:firstLineChars="0"/>
-              <w:jc w:val="left"/>
-            </w:pPr>
-            <w:r>
-              <w:rPr>
-                <w:rFonts w:ascii="Times New Roman" w:hAnsi="Times New Roman" w:cs="Times New Roman" w:eastAsia="宋体"/>
-                <w:sz w:val="21"/>
-                <w:szCs w:val="21"/>
-              </w:rPr>
-              <w:t xml:space="preserve">A</w:t>
             </w:r>
           </w:p>
         </w:tc>
@@ -3302,7 +3083,7 @@
       <w:tr>
         <w:tc>
           <w:tcPr>
-            <w:tcW w:w="1711" w:type="dxa"/>
+            <w:tcW w:w="2093" w:type="dxa"/>
             <w:vAlign w:val="center"/>
           </w:tcPr>
           <w:p>
@@ -3324,7 +3105,7 @@
         </w:tc>
         <w:tc>
           <w:tcPr>
-            <w:tcW w:w="2518" w:type="dxa"/>
+            <w:tcW w:w="3081" w:type="dxa"/>
             <w:vAlign w:val="center"/>
           </w:tcPr>
           <w:p>
@@ -3346,7 +3127,7 @@
         </w:tc>
         <w:tc>
           <w:tcPr>
-            <w:tcW w:w="1711" w:type="dxa"/>
+            <w:tcW w:w="2093" w:type="dxa"/>
             <w:vAlign w:val="center"/>
           </w:tcPr>
           <w:p>
@@ -3368,7 +3149,7 @@
         </w:tc>
         <w:tc>
           <w:tcPr>
-            <w:tcW w:w="1711" w:type="dxa"/>
+            <w:tcW w:w="2093" w:type="dxa"/>
             <w:vAlign w:val="center"/>
           </w:tcPr>
           <w:p>
@@ -3385,28 +3166,6 @@
                 <w:szCs w:val="21"/>
               </w:rPr>
               <w:t xml:space="preserve">[0,1]</w:t>
-            </w:r>
-          </w:p>
-        </w:tc>
-        <w:tc>
-          <w:tcPr>
-            <w:tcW w:w="1709" w:type="dxa"/>
-            <w:vAlign w:val="center"/>
-          </w:tcPr>
-          <w:p>
-            <w:pPr>
-              <w:pStyle w:val="Compact"/>
-              <w:spacing w:before="0" w:after="0" w:line="360" w:lineRule="auto"/>
-              <w:ind w:firstLineChars="0"/>
-              <w:jc w:val="left"/>
-            </w:pPr>
-            <w:r>
-              <w:rPr>
-                <w:rFonts w:ascii="Times New Roman" w:hAnsi="Times New Roman" w:cs="Times New Roman" w:eastAsia="宋体"/>
-                <w:sz w:val="21"/>
-                <w:szCs w:val="21"/>
-              </w:rPr>
-              <w:t xml:space="preserve">B</w:t>
             </w:r>
           </w:p>
         </w:tc>
@@ -3414,7 +3173,7 @@
       <w:tr>
         <w:tc>
           <w:tcPr>
-            <w:tcW w:w="1711" w:type="dxa"/>
+            <w:tcW w:w="2093" w:type="dxa"/>
             <w:vAlign w:val="center"/>
           </w:tcPr>
           <w:p>
@@ -3436,7 +3195,7 @@
         </w:tc>
         <w:tc>
           <w:tcPr>
-            <w:tcW w:w="2518" w:type="dxa"/>
+            <w:tcW w:w="3081" w:type="dxa"/>
             <w:vAlign w:val="center"/>
           </w:tcPr>
           <w:p>
@@ -3458,7 +3217,7 @@
         </w:tc>
         <w:tc>
           <w:tcPr>
-            <w:tcW w:w="1711" w:type="dxa"/>
+            <w:tcW w:w="2093" w:type="dxa"/>
             <w:vAlign w:val="center"/>
           </w:tcPr>
           <w:p>
@@ -3480,7 +3239,7 @@
         </w:tc>
         <w:tc>
           <w:tcPr>
-            <w:tcW w:w="1711" w:type="dxa"/>
+            <w:tcW w:w="2093" w:type="dxa"/>
             <w:vAlign w:val="center"/>
           </w:tcPr>
           <w:p>
@@ -3497,28 +3256,6 @@
                 <w:szCs w:val="21"/>
               </w:rPr>
               <w:t xml:space="preserve">[0,1]</w:t>
-            </w:r>
-          </w:p>
-        </w:tc>
-        <w:tc>
-          <w:tcPr>
-            <w:tcW w:w="1709" w:type="dxa"/>
-            <w:vAlign w:val="center"/>
-          </w:tcPr>
-          <w:p>
-            <w:pPr>
-              <w:pStyle w:val="Compact"/>
-              <w:spacing w:before="0" w:after="0" w:line="360" w:lineRule="auto"/>
-              <w:ind w:firstLineChars="0"/>
-              <w:jc w:val="left"/>
-            </w:pPr>
-            <w:r>
-              <w:rPr>
-                <w:rFonts w:ascii="Times New Roman" w:hAnsi="Times New Roman" w:cs="Times New Roman" w:eastAsia="宋体"/>
-                <w:sz w:val="21"/>
-                <w:szCs w:val="21"/>
-              </w:rPr>
-              <w:t xml:space="preserve">B</w:t>
             </w:r>
           </w:p>
         </w:tc>
@@ -3526,7 +3263,7 @@
       <w:tr>
         <w:tc>
           <w:tcPr>
-            <w:tcW w:w="1711" w:type="dxa"/>
+            <w:tcW w:w="2093" w:type="dxa"/>
             <w:vAlign w:val="center"/>
           </w:tcPr>
           <w:p>
@@ -3548,7 +3285,7 @@
         </w:tc>
         <w:tc>
           <w:tcPr>
-            <w:tcW w:w="2518" w:type="dxa"/>
+            <w:tcW w:w="3081" w:type="dxa"/>
             <w:vAlign w:val="center"/>
           </w:tcPr>
           <w:p>
@@ -3570,7 +3307,7 @@
         </w:tc>
         <w:tc>
           <w:tcPr>
-            <w:tcW w:w="1711" w:type="dxa"/>
+            <w:tcW w:w="2093" w:type="dxa"/>
             <w:vAlign w:val="center"/>
           </w:tcPr>
           <w:p>
@@ -3592,7 +3329,7 @@
         </w:tc>
         <w:tc>
           <w:tcPr>
-            <w:tcW w:w="1711" w:type="dxa"/>
+            <w:tcW w:w="2093" w:type="dxa"/>
             <w:vAlign w:val="center"/>
           </w:tcPr>
           <w:p>
@@ -3609,28 +3346,6 @@
                 <w:szCs w:val="21"/>
               </w:rPr>
               <w:t xml:space="preserve">[0,1]</w:t>
-            </w:r>
-          </w:p>
-        </w:tc>
-        <w:tc>
-          <w:tcPr>
-            <w:tcW w:w="1709" w:type="dxa"/>
-            <w:vAlign w:val="center"/>
-          </w:tcPr>
-          <w:p>
-            <w:pPr>
-              <w:pStyle w:val="Compact"/>
-              <w:spacing w:before="0" w:after="0" w:line="360" w:lineRule="auto"/>
-              <w:ind w:firstLineChars="0"/>
-              <w:jc w:val="left"/>
-            </w:pPr>
-            <w:r>
-              <w:rPr>
-                <w:rFonts w:ascii="Times New Roman" w:hAnsi="Times New Roman" w:cs="Times New Roman" w:eastAsia="宋体"/>
-                <w:sz w:val="21"/>
-                <w:szCs w:val="21"/>
-              </w:rPr>
-              <w:t xml:space="preserve">B</w:t>
             </w:r>
           </w:p>
         </w:tc>
@@ -3638,7 +3353,7 @@
       <w:tr>
         <w:tc>
           <w:tcPr>
-            <w:tcW w:w="1711" w:type="dxa"/>
+            <w:tcW w:w="2093" w:type="dxa"/>
             <w:vAlign w:val="center"/>
           </w:tcPr>
           <w:p>
@@ -3660,7 +3375,7 @@
         </w:tc>
         <w:tc>
           <w:tcPr>
-            <w:tcW w:w="2518" w:type="dxa"/>
+            <w:tcW w:w="3081" w:type="dxa"/>
             <w:vAlign w:val="center"/>
           </w:tcPr>
           <w:p>
@@ -3682,7 +3397,7 @@
         </w:tc>
         <w:tc>
           <w:tcPr>
-            <w:tcW w:w="1711" w:type="dxa"/>
+            <w:tcW w:w="2093" w:type="dxa"/>
             <w:vAlign w:val="center"/>
           </w:tcPr>
           <w:p>
@@ -3704,7 +3419,7 @@
         </w:tc>
         <w:tc>
           <w:tcPr>
-            <w:tcW w:w="1711" w:type="dxa"/>
+            <w:tcW w:w="2093" w:type="dxa"/>
             <w:vAlign w:val="center"/>
           </w:tcPr>
           <w:p>
@@ -3721,28 +3436,6 @@
                 <w:szCs w:val="21"/>
               </w:rPr>
               <w:t xml:space="preserve">[0,0.25]</w:t>
-            </w:r>
-          </w:p>
-        </w:tc>
-        <w:tc>
-          <w:tcPr>
-            <w:tcW w:w="1709" w:type="dxa"/>
-            <w:vAlign w:val="center"/>
-          </w:tcPr>
-          <w:p>
-            <w:pPr>
-              <w:pStyle w:val="Compact"/>
-              <w:spacing w:before="0" w:after="0" w:line="360" w:lineRule="auto"/>
-              <w:ind w:firstLineChars="0"/>
-              <w:jc w:val="left"/>
-            </w:pPr>
-            <w:r>
-              <w:rPr>
-                <w:rFonts w:ascii="Times New Roman" w:hAnsi="Times New Roman" w:cs="Times New Roman" w:eastAsia="宋体"/>
-                <w:sz w:val="21"/>
-                <w:szCs w:val="21"/>
-              </w:rPr>
-              <w:t xml:space="preserve">B</w:t>
             </w:r>
           </w:p>
         </w:tc>
@@ -4130,9 +3823,10 @@
     <w:p>
       <w:pPr>
         <w:pStyle w:val="SourceCode"/>
+        <w:spacing w:before="120" w:after="120" w:line="280" w:lineRule="auto"/>
+        <w:ind w:firstLineChars="0" w:left="220" w:right="220"/>
+        <w:jc w:val="left"/>
         <w:wordWrap w:val="on"/>
-        <w:spacing w:before="120" w:after="120" w:line="280" w:lineRule="auto"/>
-        <w:ind w:left="220" w:right="220" w:firstLineChars="0"/>
         <w:shd w:val="clear" w:fill="F7F7F7"/>
         <w:pBdr>
           <w:top w:val="single" w:sz="4" w:space="5" w:color="D9D9D9"/>
@@ -4140,7 +3834,6 @@
           <w:bottom w:val="single" w:sz="4" w:space="5" w:color="D9D9D9"/>
           <w:right w:val="single" w:sz="4" w:space="5" w:color="D9D9D9"/>
         </w:pBdr>
-        <w:jc w:val="left"/>
       </w:pPr>
       <w:r>
         <w:rPr>
@@ -4982,7 +4675,7 @@
         <w:rPr>
           <w:rFonts w:hint="eastAsia"/>
         </w:rPr>
-        <w:t xml:space="preserve">版本、参数与环境[1,7]。HTTP</w:t>
+        <w:t xml:space="preserve">版本、参数与环境[1]。HTTP</w:t>
       </w:r>
       <w:r>
         <w:t xml:space="preserve"> </w:t>
@@ -5288,13 +4981,13 @@
         <w:t xml:space="preserve">，指标约为</w:t>
       </w:r>
       <w:r>
-        <w:t xml:space="preserve"> 0.6667。PULSE </w:t>
-      </w:r>
-      <w:r>
-        <w:rPr>
-          <w:rFonts w:hint="eastAsia"/>
-        </w:rPr>
-        <w:t xml:space="preserve">归档测试记录可用于复算[7]。它反映候选间的功能波动；全部通过与全部失败都可能得到零，因此应同时展示平均通过率。</w:t>
+        <w:t xml:space="preserve"> </w:t>
+      </w:r>
+      <w:r>
+        <w:rPr>
+          <w:rFonts w:hint="eastAsia"/>
+        </w:rPr>
+        <w:t xml:space="preserve">0.6667。复算时使用每份候选代码在同一测试集上的通过比例。它反映候选间的功能波动；全部通过与全部失败都可能得到零，因此应同时展示平均通过率。</w:t>
       </w:r>
     </w:p>
     <w:bookmarkEnd w:id="25"/>
@@ -5511,7 +5204,7 @@
         <w:rPr>
           <w:rFonts w:hint="eastAsia"/>
         </w:rPr>
-        <w:t xml:space="preserve">0.4833。该值用于需求条件比较与选择性澄清研究[7]。固定权重便于复算，但分数没有失败概率含义；其信息来自</w:t>
+        <w:t xml:space="preserve">0.4833。该值用于需求条件比较与选择性澄清研究。固定权重便于复算，但分数没有失败概率含义；其信息来自</w:t>
       </w:r>
       <w:r>
         <w:t xml:space="preserve"> </w:t>
@@ -5888,7 +5581,7 @@
         <w:rPr>
           <w:rFonts w:hint="eastAsia"/>
         </w:rPr>
-        <w:t xml:space="preserve">。该指标已有计算入口[6]，但变量改名、行拆分也会改变得分；对</w:t>
+        <w:t xml:space="preserve">。该指标已有计算入口，但变量改名、行拆分也会改变得分；对</w:t>
       </w:r>
       <w:r>
         <w:t xml:space="preserve"> P-I01 </w:t>
@@ -6185,7 +5878,7 @@
         <w:rPr>
           <w:rFonts w:hint="eastAsia"/>
         </w:rPr>
-        <w:t xml:space="preserve">的成败记录支持该计算[6]。它关注整体成败，不保留“通过部分测试”的细节，与</w:t>
+        <w:t xml:space="preserve">的成败记录支持该计算。它关注整体成败，不保留“通过部分测试”的细节，与</w:t>
       </w:r>
       <w:r>
         <w:t xml:space="preserve"> P-I02 </w:t>
@@ -6436,7 +6129,7 @@
         <w:rPr>
           <w:rFonts w:hint="eastAsia"/>
         </w:rPr>
-        <w:t xml:space="preserve">，可作为不同统计表达，但不能仅凭公式不同认定为独立能力[6]。</w:t>
+        <w:t xml:space="preserve">，可作为不同统计表达，但不能仅凭公式不同认定为独立能力。</w:t>
       </w:r>
     </w:p>
     <w:bookmarkEnd w:id="29"/>
@@ -6701,7 +6394,7 @@
         <w:rPr>
           <w:rFonts w:hint="eastAsia"/>
         </w:rPr>
-        <w:t xml:space="preserve">0.2。页面按字符串完全一致去重，空白、注释和变量名变化也可能产生新字符串，因此该量描述文本多样性，不直接代表算法多样性[6]。</w:t>
+        <w:t xml:space="preserve">0.2。页面按字符串完全一致去重，空白、注释和变量名变化也可能产生新字符串，因此该量描述文本多样性，不直接代表算法多样性。</w:t>
       </w:r>
     </w:p>
     <w:bookmarkEnd w:id="30"/>
@@ -6945,7 +6638,7 @@
         <w:rPr>
           <w:rFonts w:hint="eastAsia"/>
         </w:rPr>
-        <w:t xml:space="preserve">配对诊断[7]，需要明确需求参照；配置变化也会影响差值，应保留两条件的测试和模型版本。</w:t>
+        <w:t xml:space="preserve">配对诊断，需要明确需求参照；配置变化也会影响差值，应保留两条件的测试和模型版本。</w:t>
       </w:r>
     </w:p>
     <w:bookmarkEnd w:id="31"/>
@@ -8239,7 +7932,7 @@
         <w:rPr>
           <w:rFonts w:hint="eastAsia"/>
         </w:rPr>
-        <w:t xml:space="preserve">仅用于演示判断，不作为论文实证阈值。规则编号、成熟度与页面保持一致[6]。</w:t>
+        <w:t xml:space="preserve">仅用于演示判断，不作为论文实证阈值。以下按编号逐项说明规则的触发条件、用途与研究依据。</w:t>
       </w:r>
     </w:p>
     <w:bookmarkEnd w:id="38"/>
@@ -8383,7 +8076,7 @@
         <w:rPr>
           <w:rFonts w:hint="eastAsia"/>
         </w:rPr>
-        <w:t xml:space="preserve">0.6，则触发。页面记录的</w:t>
+        <w:t xml:space="preserve">0.6，则触发。本项目</w:t>
       </w:r>
       <w:r>
         <w:t xml:space="preserve"> 520 </w:t>
@@ -8392,7 +8085,7 @@
         <w:rPr>
           <w:rFonts w:hint="eastAsia"/>
         </w:rPr>
-        <w:t xml:space="preserve">案例事后分组中，最低与最高</w:t>
+        <w:t xml:space="preserve">案例的事后分组分析中，最低与最高</w:t>
       </w:r>
       <w:r>
         <w:t xml:space="preserve"> UQ </w:t>
@@ -8419,10 +8112,7 @@
         <w:rPr>
           <w:rFonts w:hint="eastAsia"/>
         </w:rPr>
-        <w:t xml:space="preserve">48.75%；该探索性关系支持继续验证，当前状态为</w:t>
-      </w:r>
-      <w:r>
-        <w:t xml:space="preserve"> B[6]。</w:t>
+        <w:t xml:space="preserve">48.75%；该探索性关系支持继续验证。</w:t>
       </w:r>
     </w:p>
     <w:bookmarkEnd w:id="39"/>
@@ -8510,10 +8200,7 @@
         <w:rPr>
           <w:rFonts w:hint="eastAsia"/>
         </w:rPr>
-        <w:t xml:space="preserve">个百分点；这一类均值差异为规则提供依据，不能直接作为单任务下降幅度。状态为</w:t>
-      </w:r>
-      <w:r>
-        <w:t xml:space="preserve"> B[6,7]。</w:t>
+        <w:t xml:space="preserve">个百分点；这一类均值差异为规则提供依据，不能直接作为单任务下降幅度。</w:t>
       </w:r>
     </w:p>
     <w:bookmarkEnd w:id="40"/>
@@ -8601,10 +8288,7 @@
         <w:rPr>
           <w:rFonts w:hint="eastAsia"/>
         </w:rPr>
-        <w:t xml:space="preserve">共用类别触发模板，状态为</w:t>
-      </w:r>
-      <w:r>
-        <w:t xml:space="preserve"> B[6,7]。</w:t>
+        <w:t xml:space="preserve">共用类别触发模板。</w:t>
       </w:r>
     </w:p>
     <w:bookmarkEnd w:id="41"/>
@@ -8766,16 +8450,7 @@
         <w:rPr>
           <w:rFonts w:hint="eastAsia"/>
         </w:rPr>
-        <w:t xml:space="preserve">0.003。状态为</w:t>
-      </w:r>
-      <w:r>
-        <w:t xml:space="preserve"> </w:t>
-      </w:r>
-      <w:r>
-        <w:rPr>
-          <w:rFonts w:hint="eastAsia"/>
-        </w:rPr>
-        <w:t xml:space="preserve">B；条件中的语义缺口不能仅由低</w:t>
+        <w:t xml:space="preserve">0.003。条件中的语义缺口不能仅由低</w:t>
       </w:r>
       <w:r>
         <w:t xml:space="preserve"> UQ </w:t>
@@ -8784,7 +8459,7 @@
         <w:rPr>
           <w:rFonts w:hint="eastAsia"/>
         </w:rPr>
-        <w:t xml:space="preserve">推断[6,7]。</w:t>
+        <w:t xml:space="preserve">推断。</w:t>
       </w:r>
     </w:p>
     <w:bookmarkEnd w:id="42"/>
@@ -8854,16 +8529,7 @@
         <w:rPr>
           <w:rFonts w:hint="eastAsia"/>
         </w:rPr>
-        <w:t xml:space="preserve">例如原需求允许零值，追加回答却无依据地限定“仅正数”，应触发。该规则源于澄清负收益案例及防护要求，当前状态为</w:t>
-      </w:r>
-      <w:r>
-        <w:t xml:space="preserve"> </w:t>
-      </w:r>
-      <w:r>
-        <w:rPr>
-          <w:rFonts w:hint="eastAsia"/>
-        </w:rPr>
-        <w:t xml:space="preserve">C；核对字段由人工或外部检查器给出，条件函数本身不证明回答真实[6]。</w:t>
+        <w:t xml:space="preserve">例如原需求允许零值，追加回答却无依据地限定“仅正数”，应触发。该规则源于澄清负收益案例及防护要求；核对字段由人工或外部检查器给出，条件函数本身不证明回答真实。</w:t>
       </w:r>
     </w:p>
     <w:bookmarkEnd w:id="43"/>
@@ -8959,16 +8625,7 @@
         <w:rPr>
           <w:rFonts w:hint="eastAsia"/>
         </w:rPr>
-        <w:t xml:space="preserve">例如任务只允许处理奇数位置，但这一条件在输入中丢失，模型可能稳定处理全部位置。既有案例支持这一风险机制，状态为</w:t>
-      </w:r>
-      <w:r>
-        <w:t xml:space="preserve"> </w:t>
-      </w:r>
-      <w:r>
-        <w:rPr>
-          <w:rFonts w:hint="eastAsia"/>
-        </w:rPr>
-        <w:t xml:space="preserve">C。与</w:t>
+        <w:t xml:space="preserve">例如任务只允许处理奇数位置，但这一条件在输入中丢失，模型可能稳定处理全部位置。既有案例支持这一风险机制。与</w:t>
       </w:r>
       <w:r>
         <w:t xml:space="preserve"> P-R04 </w:t>
@@ -8977,7 +8634,7 @@
         <w:rPr>
           <w:rFonts w:hint="eastAsia"/>
         </w:rPr>
-        <w:t xml:space="preserve">相比，本条强调决定性约束缺失及稳定误解；两条存在交叉，需在正式计数时核对[6]。</w:t>
+        <w:t xml:space="preserve">相比，本条强调决定性约束缺失及稳定误解；两条存在交叉，需在正式计数时核对。</w:t>
       </w:r>
     </w:p>
     <w:bookmarkEnd w:id="44"/>
@@ -9130,16 +8787,7 @@
         <w:rPr>
           <w:rFonts w:hint="eastAsia"/>
         </w:rPr>
-        <w:t xml:space="preserve">0.158。当前状态为</w:t>
-      </w:r>
-      <w:r>
-        <w:t xml:space="preserve"> </w:t>
-      </w:r>
-      <w:r>
-        <w:rPr>
-          <w:rFonts w:hint="eastAsia"/>
-        </w:rPr>
-        <w:t xml:space="preserve">C；阈值分类性能需要独立数据验证[5,6]。</w:t>
+        <w:t xml:space="preserve">0.158。阈值分类性能需要独立数据验证[5]。</w:t>
       </w:r>
     </w:p>
     <w:bookmarkEnd w:id="45"/>
@@ -9256,16 +8904,7 @@
         <w:rPr>
           <w:rFonts w:hint="eastAsia"/>
         </w:rPr>
-        <w:t xml:space="preserve">0.198/0.101。当前状态为</w:t>
-      </w:r>
-      <w:r>
-        <w:t xml:space="preserve"> </w:t>
-      </w:r>
-      <w:r>
-        <w:rPr>
-          <w:rFonts w:hint="eastAsia"/>
-        </w:rPr>
-        <w:t xml:space="preserve">C，与另外两维共享低分触发规则族[5,6]。</w:t>
+        <w:t xml:space="preserve">0.198/0.101。该规则与另外两维共享低分触发规则族[5]。</w:t>
       </w:r>
     </w:p>
     <w:bookmarkEnd w:id="46"/>
@@ -9382,10 +9021,7 @@
         <w:rPr>
           <w:rFonts w:hint="eastAsia"/>
         </w:rPr>
-        <w:t xml:space="preserve">0.102/0.079，关联较弱，当前状态为</w:t>
-      </w:r>
-      <w:r>
-        <w:t xml:space="preserve"> C[5,6]。</w:t>
+        <w:t xml:space="preserve">0.102/0.079，关联较弱[5]。</w:t>
       </w:r>
     </w:p>
     <w:bookmarkEnd w:id="47"/>
@@ -9556,16 +9192,7 @@
         <w:rPr>
           <w:rFonts w:hint="eastAsia"/>
         </w:rPr>
-        <w:t xml:space="preserve">如测试失败且已修复计划两次，则继续这一阶段。论文以可行性、相关性、清晰度指导修复，公开测试结果决定是否继续。页面状态为</w:t>
-      </w:r>
-      <w:r>
-        <w:t xml:space="preserve"> </w:t>
-      </w:r>
-      <w:r>
-        <w:rPr>
-          <w:rFonts w:hint="eastAsia"/>
-        </w:rPr>
-        <w:t xml:space="preserve">A，成果类型为修复策略[5,6]。</w:t>
+        <w:t xml:space="preserve">如测试失败且已修复计划两次，则继续这一阶段。论文以可行性、相关性、清晰度指导修复，公开测试结果决定是否继续。该条目属于修复策略[5]。</w:t>
       </w:r>
     </w:p>
     <w:bookmarkEnd w:id="48"/>
@@ -9771,10 +9398,7 @@
         <w:rPr>
           <w:rFonts w:hint="eastAsia"/>
         </w:rPr>
-        <w:t xml:space="preserve">如计划修复五次仍失败、代码修复尚未开始，则触发。进入阶段时用最终计划检索、重排参考案例；之后固定计划及案例，逐轮更新失败代码与反馈。状态为</w:t>
-      </w:r>
-      <w:r>
-        <w:t xml:space="preserve"> A[5,6]。</w:t>
+        <w:t xml:space="preserve">如计划修复五次仍失败、代码修复尚未开始，则触发。进入阶段时用最终计划检索、重排参考案例；之后固定计划及案例，逐轮更新失败代码与反馈[5]。</w:t>
       </w:r>
     </w:p>
     <w:bookmarkEnd w:id="49"/>
@@ -9914,10 +9538,7 @@
         <w:rPr>
           <w:rFonts w:hint="eastAsia"/>
         </w:rPr>
-        <w:t xml:space="preserve">首次生成即通过时无需耗尽预算；执行完五次计划修复和六次代码修复仍失败时也应停止。公开测试通过与预算耗尽须记录不同停止原因，状态为</w:t>
-      </w:r>
-      <w:r>
-        <w:t xml:space="preserve"> A[5,6]。</w:t>
+        <w:t xml:space="preserve">首次生成即通过时无需耗尽预算；执行完五次计划修复和六次代码修复仍失败时也应停止。公开测试通过与预算耗尽须记录不同停止原因[5]。</w:t>
       </w:r>
     </w:p>
     <w:bookmarkEnd w:id="50"/>
@@ -9944,9 +9565,10 @@
     <w:p>
       <w:pPr>
         <w:pStyle w:val="SourceCode"/>
+        <w:spacing w:before="120" w:after="120" w:line="280" w:lineRule="auto"/>
+        <w:ind w:firstLineChars="0" w:left="220" w:right="220"/>
+        <w:jc w:val="left"/>
         <w:wordWrap w:val="on"/>
-        <w:spacing w:before="120" w:after="120" w:line="280" w:lineRule="auto"/>
-        <w:ind w:left="220" w:right="220" w:firstLineChars="0"/>
         <w:shd w:val="clear" w:fill="F7F7F7"/>
         <w:pBdr>
           <w:top w:val="single" w:sz="4" w:space="5" w:color="D9D9D9"/>
@@ -9954,7 +9576,6 @@
           <w:bottom w:val="single" w:sz="4" w:space="5" w:color="D9D9D9"/>
           <w:right w:val="single" w:sz="4" w:space="5" w:color="D9D9D9"/>
         </w:pBdr>
-        <w:jc w:val="left"/>
       </w:pPr>
       <w:r>
         <w:rPr>
@@ -10417,7 +10038,7 @@
         <w:rPr>
           <w:rFonts w:hint="eastAsia"/>
         </w:rPr>
-        <w:t xml:space="preserve">本章依据</w:t>
+        <w:t xml:space="preserve">本章报告本项目</w:t>
       </w:r>
       <w:r>
         <w:t xml:space="preserve"> PULSE </w:t>
@@ -10426,7 +10047,7 @@
         <w:rPr>
           <w:rFonts w:hint="eastAsia"/>
         </w:rPr>
-        <w:t xml:space="preserve">研究归档中的受控诊断与文本审核结果[7]，计划质量分析以论文表</w:t>
+        <w:t xml:space="preserve">受控诊断与文本审核的实验设置及结果，计划质量分析以文献[5]表</w:t>
       </w:r>
       <w:r>
         <w:t xml:space="preserve"> </w:t>
@@ -10444,7 +10065,7 @@
         <w:rPr>
           <w:rFonts w:hint="eastAsia"/>
         </w:rPr>
-        <w:t xml:space="preserve">为依据[5]。数值说明指标和规则的研究来源，算法解释与接口样例见前两章。</w:t>
+        <w:t xml:space="preserve">为依据。数值说明指标和规则的研究来源，算法解释与接口样例见前两章。</w:t>
       </w:r>
     </w:p>
     <w:bookmarkStart w:id="53" w:name="受控诊断的数据组织"/>
@@ -11671,7 +11292,7 @@
     </w:p>
     <w:bookmarkEnd w:id="59"/>
     <w:bookmarkEnd w:id="60"/>
-    <w:bookmarkStart w:id="67" w:name="条目组织接口与验证安排"/>
+    <w:bookmarkStart w:id="65" w:name="条目组织接口与验证安排"/>
     <w:p>
       <w:pPr>
         <w:pStyle w:val="Heading1"/>
@@ -12497,20 +12118,20 @@
         <w:rPr>
           <w:rFonts w:hint="eastAsia"/>
         </w:rPr>
-        <w:t xml:space="preserve">类别标签、计算结果和质量结果分别保存。测试失败本身不能确定来源首次出现于哪个环节，必须结合需求、计划和代码版本分析。配套《智能软件决策多元不确定性主动感知方法研究报告》进一步说明这些观测量如何进入主动澄清、PlanCoder</w:t>
-      </w:r>
-      <w:r>
-        <w:t xml:space="preserve"> </w:t>
-      </w:r>
-      <w:r>
-        <w:rPr>
-          <w:rFonts w:hint="eastAsia"/>
-        </w:rPr>
-        <w:t xml:space="preserve">修复及推理与检索协同的方法流程。</w:t>
+        <w:t xml:space="preserve">类别标签、计算结果和质量结果分别保存。测试失败本身不能确定来源首次出现于哪个环节，必须结合需求、计划和代码版本分析。这些观测量可用于主动澄清、PlanCoder</w:t>
+      </w:r>
+      <w:r>
+        <w:t xml:space="preserve"> </w:t>
+      </w:r>
+      <w:r>
+        <w:rPr>
+          <w:rFonts w:hint="eastAsia"/>
+        </w:rPr>
+        <w:t xml:space="preserve">修复及检索控制：需求缺口触发信息补充，计划缺陷指导方案修订，公开测试反馈决定是否继续修复。</w:t>
       </w:r>
     </w:p>
     <w:bookmarkEnd w:id="61"/>
-    <w:bookmarkStart w:id="64" w:name="页面与接口的对应"/>
+    <w:bookmarkStart w:id="62" w:name="页面与接口的对应"/>
     <w:p>
       <w:pPr>
         <w:pStyle w:val="Heading2"/>
@@ -12613,42 +12234,10 @@
         <w:rPr>
           <w:rFonts w:hint="eastAsia"/>
         </w:rPr>
-        <w:t xml:space="preserve">为规则或策略。页面支持按研究工作、成果类型和成熟度筛选。各条目通过统一接口获取定义并进行试算，完整字段见</w:t>
-      </w:r>
-      <w:r>
-        <w:t xml:space="preserve"> </w:t>
-      </w:r>
-      <w:hyperlink r:id="rId62">
-        <w:r>
-          <w:rPr>
-            <w:rStyle w:val="Hyperlink"/>
-          </w:rPr>
-          <w:t xml:space="preserve">OpenAPI</w:t>
-        </w:r>
-      </w:hyperlink>
-      <w:r>
-        <w:t xml:space="preserve"> </w:t>
-      </w:r>
-      <w:r>
-        <w:rPr>
-          <w:rFonts w:hint="eastAsia"/>
-        </w:rPr>
-        <w:t xml:space="preserve">与</w:t>
-      </w:r>
-      <w:r>
-        <w:t xml:space="preserve"> </w:t>
-      </w:r>
-      <w:hyperlink r:id="rId63">
-        <w:r>
-          <w:rPr>
-            <w:rStyle w:val="Hyperlink"/>
-            <w:rFonts w:hint="eastAsia"/>
-          </w:rPr>
-          <w:t xml:space="preserve">项目说明</w:t>
-        </w:r>
-      </w:hyperlink>
-      <w:r>
-        <w:t xml:space="preserve">。</w:t>
+        <w:t xml:space="preserve">为规则或策略。页面支持按研究工作、成果类型筛选及关键词检索。各条目通过统一接口获取定义并进行试算，主要输入输出见下表，具体算例和边界约定见附录</w:t>
+      </w:r>
+      <w:r>
+        <w:t xml:space="preserve"> A。</w:t>
       </w:r>
     </w:p>
     <w:tbl>
@@ -13443,8 +13032,8 @@
         <w:t xml:space="preserve">，需要调用方先按固定规则计算全部候选对的相似度。规则函数也只消费给定的类别与语义检查结果；将代码文本提交给接口、或将一个布尔字段设为真，不等于完成了原研究的全部识别过程。</w:t>
       </w:r>
     </w:p>
-    <w:bookmarkEnd w:id="64"/>
-    <w:bookmarkStart w:id="65" w:name="独立性与成果类型"/>
+    <w:bookmarkEnd w:id="62"/>
+    <w:bookmarkStart w:id="63" w:name="独立性与成果类型"/>
     <w:p>
       <w:pPr>
         <w:pStyle w:val="Heading2"/>
@@ -13612,8 +13201,8 @@
         <w:t xml:space="preserve">是有明确条件的流程控制策略。正式归类应保留这些关系，并依据任务协议分别核定风险预测、机制检查与修复策略的成果类型。</w:t>
       </w:r>
     </w:p>
-    <w:bookmarkEnd w:id="65"/>
-    <w:bookmarkStart w:id="66" w:name="统一验证程序"/>
+    <w:bookmarkEnd w:id="63"/>
+    <w:bookmarkStart w:id="64" w:name="统一验证程序"/>
     <w:p>
       <w:pPr>
         <w:pStyle w:val="Heading2"/>
@@ -14156,9 +13745,9 @@
         <w:t xml:space="preserve">正式验证按基础任务划分开发集和测试集，避免同题变体跨集合。真实评分、历史计算和合成算例分别标注来源；对测试适配器或相似度实现的修订保留前后版本。原始评分、传播联合数据、类别全集及第三方测评结果是后续验证与成果归档的关键材料。</w:t>
       </w:r>
     </w:p>
-    <w:bookmarkEnd w:id="66"/>
-    <w:bookmarkEnd w:id="67"/>
-    <w:bookmarkStart w:id="70" w:name="综合算例与结论"/>
+    <w:bookmarkEnd w:id="64"/>
+    <w:bookmarkEnd w:id="65"/>
+    <w:bookmarkStart w:id="68" w:name="综合算例与结论"/>
     <w:p>
       <w:pPr>
         <w:pStyle w:val="Heading1"/>
@@ -14178,7 +13767,7 @@
         <w:t xml:space="preserve">综合算例与结论</w:t>
       </w:r>
     </w:p>
-    <w:bookmarkStart w:id="68" w:name="一个任务如何连接多个指标"/>
+    <w:bookmarkStart w:id="66" w:name="一个任务如何连接多个指标"/>
     <w:p>
       <w:pPr>
         <w:pStyle w:val="Heading2"/>
@@ -14836,8 +14425,8 @@
         <w:t xml:space="preserve">S-R04。是否触发低计划质量规则，需要先取得相应维度评分和预先指定阈值；是否属于需求歧义，需要独立的文本或语义证据。</w:t>
       </w:r>
     </w:p>
-    <w:bookmarkEnd w:id="68"/>
-    <w:bookmarkStart w:id="69" w:name="结论"/>
+    <w:bookmarkEnd w:id="66"/>
+    <w:bookmarkStart w:id="67" w:name="结论"/>
     <w:p>
       <w:pPr>
         <w:pStyle w:val="Heading2"/>
@@ -14894,12 +14483,12 @@
         <w:rPr>
           <w:rFonts w:hint="eastAsia"/>
         </w:rPr>
-        <w:t xml:space="preserve">当前目录已形成从名称、编号、函数到研究依据的对应关系。进一步工作集中在固定数据与实现版本、验证风险阈值、补齐评分原始记录和核定独立条目；具体主动感知方法及其效果见配套《智能软件决策多元不确定性主动感知方法研究报告》。</w:t>
-      </w:r>
-    </w:p>
-    <w:bookmarkEnd w:id="69"/>
-    <w:bookmarkEnd w:id="70"/>
-    <w:bookmarkStart w:id="77" w:name="参考文献与资料依据"/>
+        <w:t xml:space="preserve">当前目录已形成从名称、编号、函数到研究依据的对应关系。进一步工作集中在固定数据与实现版本、验证风险阈值、补齐评分原始记录和核定独立条目。这些工作为需求澄清、计划修复和检索控制提供可验证的决策依据。</w:t>
+      </w:r>
+    </w:p>
+    <w:bookmarkEnd w:id="67"/>
+    <w:bookmarkEnd w:id="68"/>
+    <w:bookmarkStart w:id="69" w:name="参考文献"/>
     <w:p>
       <w:pPr>
         <w:pStyle w:val="Heading1"/>
@@ -14909,7 +14498,7 @@
           <w:rFonts w:hint="eastAsia" w:ascii="黑体" w:hAnsi="黑体" w:cs="黑体" w:eastAsia="黑体"/>
           <w:color w:val="000000"/>
         </w:rPr>
-        <w:t xml:space="preserve">参考文献与资料依据</w:t>
+        <w:t xml:space="preserve">参考文献</w:t>
       </w:r>
     </w:p>
     <w:p>
@@ -14917,7 +14506,7 @@
         <w:pStyle w:val="FirstParagraph"/>
       </w:pPr>
       <w:r>
-        <w:t xml:space="preserve">[1] Ren S, Guo D, Lu S, et al. CodeBLEU: a Method for Automatic Evaluation of Code Synthesis. arXiv:2009.10297, 2020. https://arxiv.org/abs/2009.10297</w:t>
+        <w:t xml:space="preserve">[1] Ren S, Guo D, Lu S, et al. CodeBLEU: a Method for Automatic Evaluation of Code Synthesis. arXiv:2009.10297, 2020.</w:t>
       </w:r>
     </w:p>
     <w:p>
@@ -14925,7 +14514,7 @@
         <w:pStyle w:val="BodyText"/>
       </w:pPr>
       <w:r>
-        <w:t xml:space="preserve">[2] Mu F, Shi L, Wang S, et al. ClarifyGPT: A Framework for Enhancing LLM-Based Code Generation via Requirements Clarification. Proceedings of the ACM on Software Engineering, 2024. https://doi.org/10.1145/3660810</w:t>
+        <w:t xml:space="preserve">[2] Mu F, Shi L, Wang S, et al. ClarifyGPT: A Framework for Enhancing LLM-Based Code Generation via Requirements Clarification. Proceedings of the ACM on Software Engineering, 2024. DOI: 10.1145/3660810</w:t>
       </w:r>
     </w:p>
     <w:p>
@@ -14933,7 +14522,7 @@
         <w:pStyle w:val="BodyText"/>
       </w:pPr>
       <w:r>
-        <w:t xml:space="preserve">[3] Li H-S, Mesgar M, Martins A, Gurevych I. Python Code Generation by Asking Clarification Questions. ACL, 2023. https://aclanthology.org/2023.acl-long.799/</w:t>
+        <w:t xml:space="preserve">[3] Li H-S, Mesgar M, Martins A, Gurevych I. Python Code Generation by Asking Clarification Questions. ACL, 2023.</w:t>
       </w:r>
     </w:p>
     <w:p>
@@ -14941,7 +14530,7 @@
         <w:pStyle w:val="BodyText"/>
       </w:pPr>
       <w:r>
-        <w:t xml:space="preserve">[4] Kobalczyk K, Astorga N, Liu T, van der Schaar M. Active Task Disambiguation with LLMs. ICLR, 2025. https://proceedings.iclr.cc/paper_files/paper/2025/hash/5e07476b6bd2497e1fbd11b8f0b2de3c-Abstract-Conference.html</w:t>
+        <w:t xml:space="preserve">[4] Kobalczyk K, Astorga N, Liu T, van der Schaar M. Active Task Disambiguation with LLMs. ICLR, 2025.</w:t>
       </w:r>
     </w:p>
     <w:p>
@@ -15030,179 +14619,8 @@
         <w:t xml:space="preserve">4～7。</w:t>
       </w:r>
     </w:p>
-    <w:p>
-      <w:pPr>
-        <w:pStyle w:val="BodyText"/>
-      </w:pPr>
-      <w:r>
-        <w:t xml:space="preserve">[6] </w:t>
-      </w:r>
-      <w:r>
-        <w:rPr>
-          <w:rFonts w:hint="eastAsia"/>
-        </w:rPr>
-        <w:t xml:space="preserve">项目指标与规则展示目录，</w:t>
-      </w:r>
-      <w:hyperlink r:id="rId71">
-        <w:r>
-          <w:rPr>
-            <w:rStyle w:val="Hyperlink"/>
-          </w:rPr>
-          <w:t xml:space="preserve">catalog.json</w:t>
-        </w:r>
-      </w:hyperlink>
-      <w:r>
-        <w:t xml:space="preserve">、</w:t>
-      </w:r>
-      <w:hyperlink r:id="rId72">
-        <w:r>
-          <w:rPr>
-            <w:rStyle w:val="Hyperlink"/>
-            <w:rFonts w:hint="eastAsia"/>
-          </w:rPr>
-          <w:t xml:space="preserve">首页</w:t>
-        </w:r>
-      </w:hyperlink>
-      <w:r>
-        <w:t xml:space="preserve">、</w:t>
-      </w:r>
-      <w:hyperlink r:id="rId73">
-        <w:r>
-          <w:rPr>
-            <w:rStyle w:val="Hyperlink"/>
-            <w:rFonts w:hint="eastAsia"/>
-          </w:rPr>
-          <w:t xml:space="preserve">函数入口</w:t>
-        </w:r>
-      </w:hyperlink>
-      <w:r>
-        <w:t xml:space="preserve">、</w:t>
-      </w:r>
-      <w:hyperlink r:id="rId74">
-        <w:r>
-          <w:rPr>
-            <w:rStyle w:val="Hyperlink"/>
-          </w:rPr>
-          <w:t xml:space="preserve">PULSE </w:t>
-        </w:r>
-        <w:r>
-          <w:rPr>
-            <w:rStyle w:val="Hyperlink"/>
-            <w:rFonts w:hint="eastAsia"/>
-          </w:rPr>
-          <w:t xml:space="preserve">函数</w:t>
-        </w:r>
-      </w:hyperlink>
-      <w:r>
-        <w:t xml:space="preserve"> </w:t>
-      </w:r>
-      <w:r>
-        <w:rPr>
-          <w:rFonts w:hint="eastAsia"/>
-        </w:rPr>
-        <w:t xml:space="preserve">与</w:t>
-      </w:r>
-      <w:r>
-        <w:t xml:space="preserve"> </w:t>
-      </w:r>
-      <w:hyperlink r:id="rId62">
-        <w:r>
-          <w:rPr>
-            <w:rStyle w:val="Hyperlink"/>
-            <w:rFonts w:hint="eastAsia"/>
-          </w:rPr>
-          <w:t xml:space="preserve">接口定义</w:t>
-        </w:r>
-      </w:hyperlink>
-      <w:r>
-        <w:rPr>
-          <w:rFonts w:hint="eastAsia"/>
-        </w:rPr>
-        <w:t xml:space="preserve">。查阅日期：2026-10-24。</w:t>
-      </w:r>
-    </w:p>
-    <w:p>
-      <w:pPr>
-        <w:pStyle w:val="BodyText"/>
-      </w:pPr>
-      <w:r>
-        <w:t xml:space="preserve">[7] PULSE </w:t>
-      </w:r>
-      <w:r>
-        <w:rPr>
-          <w:rFonts w:hint="eastAsia"/>
-        </w:rPr>
-        <w:t xml:space="preserve">归档摘要：</w:t>
-      </w:r>
-      <w:hyperlink r:id="rId75">
-        <w:r>
-          <w:rPr>
-            <w:rStyle w:val="Hyperlink"/>
-          </w:rPr>
-          <w:t xml:space="preserve">pulse-evidence.json</w:t>
-        </w:r>
-      </w:hyperlink>
-      <w:r>
-        <w:rPr>
-          <w:rFonts w:hint="eastAsia"/>
-        </w:rPr>
-        <w:t xml:space="preserve">。需求分类、澄清案例与文本审核详见研究记录归档（2026-10-23，Git</w:t>
-      </w:r>
-      <w:r>
-        <w:t xml:space="preserve"> </w:t>
-      </w:r>
-      <w:r>
-        <w:rPr>
-          <w:rFonts w:hint="eastAsia"/>
-        </w:rPr>
-        <w:t xml:space="preserve">提交</w:t>
-      </w:r>
-      <w:r>
-        <w:t xml:space="preserve"> </w:t>
-      </w:r>
-      <w:r>
-        <w:rPr>
-          <w:rStyle w:val="VerbatimChar"/>
-        </w:rPr>
-        <w:t xml:space="preserve">bacfa12</w:t>
-      </w:r>
-      <w:r>
-        <w:rPr>
-          <w:rFonts w:hint="eastAsia"/>
-        </w:rPr>
-        <w:t xml:space="preserve">）；摘要文件列有原研究备份路径及文件哈希。</w:t>
-      </w:r>
-    </w:p>
-    <w:p>
-      <w:pPr>
-        <w:pStyle w:val="BodyText"/>
-      </w:pPr>
-      <w:r>
-        <w:t xml:space="preserve">[8] PlanCoder </w:t>
-      </w:r>
-      <w:r>
-        <w:rPr>
-          <w:rFonts w:hint="eastAsia"/>
-        </w:rPr>
-        <w:t xml:space="preserve">归档结果摘要：</w:t>
-      </w:r>
-      <w:hyperlink r:id="rId76">
-        <w:r>
-          <w:rPr>
-            <w:rStyle w:val="Hyperlink"/>
-          </w:rPr>
-          <w:t xml:space="preserve">plancoder-evidence.json</w:t>
-        </w:r>
-      </w:hyperlink>
-      <w:r>
-        <w:rPr>
-          <w:rFonts w:hint="eastAsia"/>
-        </w:rPr>
-        <w:t xml:space="preserve">。该文件保存主实验结果索引、计算口径和审核事项；论文中的相关性及人机一致性数值按论文报告值引用。</w:t>
-      </w:r>
-    </w:p>
-    <w:bookmarkEnd w:id="77"/>
-    <w:bookmarkStart w:id="78" w:name="附录-a-接口算例与边界约定"/>
+    <w:bookmarkEnd w:id="69"/>
+    <w:bookmarkStart w:id="70" w:name="附录-a-接口算例与边界约定"/>
     <w:p>
       <w:pPr>
         <w:pStyle w:val="Heading1"/>
@@ -15243,9 +14661,10 @@
     <w:p>
       <w:pPr>
         <w:pStyle w:val="SourceCode"/>
+        <w:spacing w:before="120" w:after="120" w:line="280" w:lineRule="auto"/>
+        <w:ind w:firstLineChars="0" w:left="220" w:right="220"/>
+        <w:jc w:val="left"/>
         <w:wordWrap w:val="on"/>
-        <w:spacing w:before="120" w:after="120" w:line="280" w:lineRule="auto"/>
-        <w:ind w:left="220" w:right="220" w:firstLineChars="0"/>
         <w:shd w:val="clear" w:fill="F7F7F7"/>
         <w:pBdr>
           <w:top w:val="single" w:sz="4" w:space="5" w:color="D9D9D9"/>
@@ -15253,7 +14672,6 @@
           <w:bottom w:val="single" w:sz="4" w:space="5" w:color="D9D9D9"/>
           <w:right w:val="single" w:sz="4" w:space="5" w:color="D9D9D9"/>
         </w:pBdr>
-        <w:jc w:val="left"/>
       </w:pPr>
       <w:r>
         <w:rPr>
@@ -15605,9 +15023,10 @@
     <w:p>
       <w:pPr>
         <w:pStyle w:val="SourceCode"/>
+        <w:spacing w:before="120" w:after="120" w:line="280" w:lineRule="auto"/>
+        <w:ind w:firstLineChars="0" w:left="220" w:right="220"/>
+        <w:jc w:val="left"/>
         <w:wordWrap w:val="on"/>
-        <w:spacing w:before="120" w:after="120" w:line="280" w:lineRule="auto"/>
-        <w:ind w:left="220" w:right="220" w:firstLineChars="0"/>
         <w:shd w:val="clear" w:fill="F7F7F7"/>
         <w:pBdr>
           <w:top w:val="single" w:sz="4" w:space="5" w:color="D9D9D9"/>
@@ -15615,7 +15034,6 @@
           <w:bottom w:val="single" w:sz="4" w:space="5" w:color="D9D9D9"/>
           <w:right w:val="single" w:sz="4" w:space="5" w:color="D9D9D9"/>
         </w:pBdr>
-        <w:jc w:val="left"/>
       </w:pPr>
       <w:r>
         <w:rPr>
@@ -16166,20 +15584,20 @@
         <w:rPr>
           <w:rFonts w:hint="eastAsia"/>
         </w:rPr>
-        <w:t xml:space="preserve">。只有满足这些格式要求才能追溯评分来源，但格式合格不等于评分正确。运行与配置细节统一维护在项目</w:t>
-      </w:r>
-      <w:r>
-        <w:t xml:space="preserve"> </w:t>
-      </w:r>
-      <w:r>
-        <w:rPr>
-          <w:rFonts w:hint="eastAsia"/>
-        </w:rPr>
-        <w:t xml:space="preserve">README；本文保留研究层面的输入、计算与解释。</w:t>
-      </w:r>
-    </w:p>
-    <w:bookmarkEnd w:id="78"/>
-    <w:bookmarkStart w:id="79" w:name="附录-b-材料归档清单"/>
+        <w:t xml:space="preserve">。只有满足这些格式要求才能追溯评分来源，但格式合格不等于评分正确。真实模型评分需要配置</w:t>
+      </w:r>
+      <w:r>
+        <w:t xml:space="preserve"> API </w:t>
+      </w:r>
+      <w:r>
+        <w:rPr>
+          <w:rFonts w:hint="eastAsia"/>
+        </w:rPr>
+        <w:t xml:space="preserve">Key、模型名称和服务基础地址；可行性评分还需提供非空可见测试数组。评分返回数值、理由、维度、评判器、标准版本和调用用量。</w:t>
+      </w:r>
+    </w:p>
+    <w:bookmarkEnd w:id="70"/>
+    <w:bookmarkStart w:id="71" w:name="附录-b-材料归档清单"/>
     <w:p>
       <w:pPr>
         <w:pStyle w:val="Heading1"/>
@@ -16217,10 +15635,10 @@
         <w:t xml:space="preserve">指标复算保留任务与需求版本、候选代码、逐断言结果、相似度版本、采样配置和中间量；计划评价保留计划原文、可见测试、评判提示、逐维分数与人工对照；规则验证保留阈值确定过程、任务划分、触发记录和后续结果；修复策略保留每阶段输入输出、预算消耗与停止原因。项目类别全集、正式计数和专家测评材料集中归档。</w:t>
       </w:r>
     </w:p>
-    <w:bookmarkEnd w:id="79"/>
-    <w:bookmarkEnd w:id="80"/>
+    <w:bookmarkEnd w:id="71"/>
+    <w:bookmarkEnd w:id="72"/>
     <w:sectPr>
-      <w:footerReference w:type="default" r:id="rId77"/>
+      <w:footerReference w:type="default" r:id="rId9"/>
       <w:footnotePr>
         <w:numRestart w:val="eachSect"/>
       </w:footnotePr>
@@ -16442,7 +15860,7 @@
   <w:docDefaults>
     <w:rPrDefault>
       <w:rPr>
-        <w:rFonts w:asciiTheme="minorHAnsi" w:cstheme="minorBidi" w:eastAsiaTheme="minorEastAsia" w:hAnsiTheme="minorHAnsi" w:ascii="Times New Roman" w:hAnsi="Times New Roman" w:cs="Times New Roman" w:eastAsia="仿宋_GB2312"/>
+        <w:rFonts w:ascii="Times New Roman" w:hAnsi="Times New Roman" w:cs="Times New Roman" w:eastAsia="仿宋_GB2312"/>
         <w:sz w:val="28"/>
         <w:szCs w:val="28"/>
         <w:lang w:bidi="ar-SA" w:eastAsia="zh-CN" w:val="en-US"/>
@@ -16532,10 +15950,10 @@
     </w:pPr>
     <w:rPr>
       <w:rFonts w:ascii="黑体" w:hAnsi="黑体" w:cs="黑体" w:eastAsia="黑体"/>
-      <w:sz w:val="40"/>
-      <w:szCs w:val="40"/>
+      <w:sz w:val="36"/>
+      <w:szCs w:val="36"/>
+      <w:color w:val="000000"/>
       <w:b w:val="1"/>
-      <w:color w:val="000000"/>
     </w:rPr>
   </w:style>
   <w:style w:customStyle="1" w:styleId="TitleChar" w:type="character">
@@ -16545,10 +15963,9 @@
     <w:uiPriority w:val="10"/>
     <w:rsid w:val="00A10FD9"/>
     <w:rPr>
-      <w:rFonts w:ascii="黑体" w:hAnsi="黑体" w:cs="黑体" w:eastAsia="黑体"/>
+      <w:rFonts w:asciiTheme="majorHAnsi" w:cstheme="majorBidi" w:eastAsiaTheme="majorEastAsia" w:hAnsiTheme="majorHAnsi"/>
       <w:sz w:val="56"/>
       <w:szCs w:val="56"/>
-      <w:color w:val="000000"/>
     </w:rPr>
   </w:style>
   <w:style w:styleId="Subtitle" w:type="paragraph">
@@ -16716,14 +16133,17 @@
     <w:pPr>
       <w:keepNext/>
       <w:keepLines/>
-      <w:spacing w:after="80" w:before="160"/>
+      <w:spacing w:after="80" w:before="180" w:line="360" w:lineRule="auto"/>
       <w:outlineLvl w:val="2"/>
+      <w:ind w:firstLineChars="0"/>
+      <w:jc w:val="left"/>
     </w:pPr>
     <w:rPr>
       <w:rFonts w:ascii="黑体" w:hAnsi="黑体" w:cs="黑体" w:eastAsia="黑体"/>
       <w:color w:val="000000"/>
       <w:sz w:val="28"/>
       <w:szCs w:val="28"/>
+      <w:b w:val="1"/>
     </w:rPr>
   </w:style>
   <w:style w:styleId="Heading4" w:type="paragraph">
@@ -16865,8 +16285,8 @@
     <w:uiPriority w:val="9"/>
     <w:rsid w:val="00A10FD9"/>
     <w:rPr>
-      <w:rFonts w:ascii="黑体" w:hAnsi="黑体" w:cs="黑体" w:eastAsia="黑体"/>
-      <w:color w:val="000000"/>
+      <w:rFonts w:asciiTheme="majorHAnsi" w:cstheme="majorBidi" w:eastAsiaTheme="majorEastAsia" w:hAnsiTheme="majorHAnsi"/>
+      <w:color w:themeColor="accent1" w:themeShade="BF" w:val="0F4761"/>
       <w:sz w:val="40"/>
       <w:szCs w:val="40"/>
     </w:rPr>
@@ -16879,8 +16299,8 @@
     <w:semiHidden/>
     <w:rsid w:val="00A10FD9"/>
     <w:rPr>
-      <w:rFonts w:ascii="黑体" w:hAnsi="黑体" w:cs="黑体" w:eastAsia="黑体"/>
-      <w:color w:val="000000"/>
+      <w:rFonts w:asciiTheme="majorHAnsi" w:cstheme="majorBidi" w:eastAsiaTheme="majorEastAsia" w:hAnsiTheme="majorHAnsi"/>
+      <w:color w:themeColor="accent1" w:themeShade="BF" w:val="0F4761"/>
       <w:sz w:val="32"/>
       <w:szCs w:val="32"/>
     </w:rPr>
@@ -16893,8 +16313,8 @@
     <w:semiHidden/>
     <w:rsid w:val="00A10FD9"/>
     <w:rPr>
-      <w:rFonts w:ascii="黑体" w:hAnsi="黑体" w:cs="黑体" w:eastAsia="黑体"/>
-      <w:color w:val="000000"/>
+      <w:rFonts w:cstheme="majorBidi" w:eastAsiaTheme="majorEastAsia"/>
+      <w:color w:themeColor="accent1" w:themeShade="BF" w:val="0F4761"/>
       <w:sz w:val="28"/>
       <w:szCs w:val="28"/>
     </w:rPr>
@@ -17158,7 +16578,8 @@
     <w:pPr>
       <w:wordWrap w:val="on"/>
       <w:spacing w:before="120" w:after="120" w:line="280" w:lineRule="auto"/>
-      <w:ind w:left="220" w:right="220" w:firstLineChars="0"/>
+      <w:ind w:firstLineChars="0" w:left="220" w:right="220"/>
+      <w:jc w:val="left"/>
       <w:shd w:val="clear" w:fill="F7F7F7"/>
       <w:pBdr>
         <w:top w:val="single" w:sz="4" w:space="5" w:color="D9D9D9"/>
@@ -17166,7 +16587,6 @@
         <w:bottom w:val="single" w:sz="4" w:space="5" w:color="D9D9D9"/>
         <w:right w:val="single" w:sz="4" w:space="5" w:color="D9D9D9"/>
       </w:pBdr>
-      <w:jc w:val="left"/>
     </w:pPr>
   </w:style>
   <w:style w:type="character" w:customStyle="1" w:styleId="KeywordTok">

</xml_diff>

<commit_message>
docs: revise reports and add method figures
</commit_message>
<xml_diff>
--- a/deliverables/研究报告_20261023/决策不确定性及其来源的分析-分类-量化方法_研究报告_20261023.docx
+++ b/deliverables/研究报告_20261023/决策不确定性及其来源的分析-分类-量化方法_研究报告_20261023.docx
@@ -190,7 +190,7 @@
         <w:rPr>
           <w:rFonts w:hint="eastAsia"/>
         </w:rPr>
-        <w:t xml:space="preserve">本项目面向大模型代码生成中的需求理解、任务规划、知识获取与执行反馈，研究不确定性如何产生、如何被观察以及如何转化为干预依据。基于需求端生成前评估、计划质量分析与修复、推理—检索信号传播三项研究，建立“决策环节—不确定性来源—可观测信号—响应方式”的分类框架。框架区分信息缺失、语义歧义、知识与推理局限、生成随机性以及反馈与环境差异，支持同一任务的多来源描述。在此基础上，组织十二项指标和十二条风险条件或修复策略，给出定义、公式、输入输出及应用案例。实验分析分别对应需求变化、计划质量、代码通过率方差和分阶段修复，并明确区分既有实验结果与演示算例。分类与量化共同支持需求澄清、计划检查和代码修复的决策；生成稳定、计划得分较高或自报置信度较高，均不能单独保证最终实现正确。</w:t>
+        <w:t xml:space="preserve">本项目面向大模型代码生成中的需求理解、任务规划、知识获取与执行反馈，研究不确定性如何产生、如何被观察以及如何转化为干预依据。围绕生成前需求评估、计划质量分析与修复、推理—检索信号传播，建立“决策环节—不确定性来源—可观测信号—响应方式”的分类框架。框架区分信息缺失、语义歧义、知识与推理局限、生成随机性以及反馈与环境差异，支持同一任务的多来源描述。在此基础上，组织十二项指标和十二条风险条件或修复策略，给出定义、公式、输入输出及应用案例。实验分析分别对应需求变化、计划质量、代码通过率方差和分阶段修复，并明确区分实验结果与演示算例。分类与量化共同支持需求澄清、计划检查和代码修复的决策；生成稳定、计划得分较高或自报置信度较高，均不能单独保证最终实现正确。</w:t>
       </w:r>
     </w:p>
     <w:p>
@@ -645,7 +645,7 @@
           <w:b/>
           <w:bCs/>
         </w:rPr>
-        <w:t xml:space="preserve">研究材料梳理确定范围。</w:t>
+        <w:t xml:space="preserve">梳理决策链确定范围。</w:t>
       </w:r>
       <w:r>
         <w:t xml:space="preserve"> </w:t>
@@ -1851,7 +1851,7 @@
         <w:rPr>
           <w:rFonts w:hint="eastAsia"/>
         </w:rPr>
-        <w:t xml:space="preserve">分类使用时，应先确定任务和观察时点，再记录原始证据及可能来源，随后选择适用指标。对同时存在需求歧义和计划遗漏的任务可保留两个标签，并记录各自依据；无法判定首次出现问题的环节时保留未知。这样的框架既容纳三项研究的共同问题，也保留各类信号的适用边界。</w:t>
+        <w:t xml:space="preserve">分类使用时，应先确定任务和观察时点，再记录原始证据及可能来源，随后选择适用指标。对同时存在需求歧义和计划遗漏的任务可保留两个标签，并记录各自依据；无法判定首次出现问题的环节时保留未知。这样的框架兼顾需求、规划与知识获取环节的共同问题，也保留各类信号的适用边界。</w:t>
       </w:r>
     </w:p>
     <w:bookmarkEnd w:id="16"/>
@@ -7135,7 +7135,7 @@
         <w:rPr>
           <w:rFonts w:hint="eastAsia"/>
         </w:rPr>
-        <w:t xml:space="preserve">。本项目固定采用总体方差；规划端既有实验每任务每设置生成五次，先计算任务内方差，再跨任务平均，现有研究材料未明确方差分母约定。同一输入和总体方差约定下，P-I02</w:t>
+        <w:t xml:space="preserve">。本项目固定采用总体方差；规划端实验每任务每设置生成五次，先计算任务内方差，再跨任务平均，原实验记录未明确方差分母约定。同一输入和总体方差约定下，P-I02</w:t>
       </w:r>
       <w:r>
         <w:t xml:space="preserve"> </w:t>
@@ -10837,7 +10837,7 @@
         <w:rPr>
           <w:rFonts w:hint="eastAsia"/>
         </w:rPr>
-        <w:t xml:space="preserve">规划端现有研究材料记录：从生成表现存在波动且至少出现一次完全成功的任务中选出</w:t>
+        <w:t xml:space="preserve">本项目规划端实验从生成表现存在波动且至少出现一次完全成功的任务中选出</w:t>
       </w:r>
       <w:r>
         <w:t xml:space="preserve"> 202 </w:t>
@@ -11365,7 +11365,7 @@
         <w:rPr>
           <w:rFonts w:hint="eastAsia"/>
         </w:rPr>
-        <w:t xml:space="preserve">规划端现有研究材料记录了每个任务、每种设置下的五次重复生成，比较直接生成、自规划和结合可见测试的计划。下表沿用该材料报告值，方差先在任务内计算，再跨任务平均。</w:t>
+        <w:t xml:space="preserve">本项目规划端实验对每个任务、每种设置重复生成五次，比较直接生成、自规划和结合可见测试的计划。下表采用实验汇总值，方差先在任务内计算，再跨任务平均。</w:t>
       </w:r>
     </w:p>
     <w:tbl>
@@ -12063,7 +12063,7 @@
         <w:rPr>
           <w:rFonts w:hint="eastAsia"/>
         </w:rPr>
-        <w:t xml:space="preserve">可在采用一致总体方差定义的本项目数据上提供归一化表达。由于现有研究材料未明确方差分母，表中值按材料报告值保留，不以转换后的数字声称已完成独立复算。</w:t>
+        <w:t xml:space="preserve">可在采用一致总体方差定义的本项目数据上提供归一化表达。由于原实验记录未明确方差分母，表中值按原实验汇总值保留，不以转换后的数字声称已完成独立复算。</w:t>
       </w:r>
     </w:p>
     <w:bookmarkEnd w:id="49"/>
@@ -12095,7 +12095,7 @@
         <w:rPr>
           <w:rFonts w:hint="eastAsia"/>
         </w:rPr>
-        <w:t xml:space="preserve">规划端现有研究材料在</w:t>
+        <w:t xml:space="preserve">本项目规划端实验在</w:t>
       </w:r>
       <w:r>
         <w:t xml:space="preserve"> MBPP、APPS、CodeContests </w:t>
@@ -14435,6 +14435,17 @@
   <w:style w:customStyle="1" w:styleId="ImageCaption" w:type="paragraph">
     <w:name w:val="Image Caption"/>
     <w:basedOn w:val="Caption"/>
+    <w:pPr>
+      <w:spacing w:before="40" w:after="120" w:line="360" w:lineRule="auto"/>
+      <w:ind w:firstLineChars="0"/>
+      <w:jc w:val="center"/>
+    </w:pPr>
+    <w:rPr>
+      <w:rFonts w:ascii="Times New Roman" w:hAnsi="Times New Roman" w:cs="Times New Roman" w:eastAsia="宋体"/>
+      <w:sz w:val="21"/>
+      <w:szCs w:val="21"/>
+      <w:i w:val="0"/>
+    </w:rPr>
   </w:style>
   <w:style w:customStyle="1" w:styleId="Figure" w:type="paragraph">
     <w:name w:val="Figure"/>
@@ -14445,7 +14456,15 @@
     <w:basedOn w:val="Figure"/>
     <w:pPr>
       <w:keepNext/>
+      <w:spacing w:before="120" w:after="0" w:line="360" w:lineRule="auto"/>
+      <w:ind w:firstLineChars="0"/>
+      <w:jc w:val="center"/>
     </w:pPr>
+    <w:rPr>
+      <w:rFonts w:ascii="Times New Roman" w:hAnsi="Times New Roman" w:cs="Times New Roman" w:eastAsia="宋体"/>
+      <w:sz w:val="21"/>
+      <w:szCs w:val="21"/>
+    </w:rPr>
   </w:style>
   <w:style w:customStyle="1" w:styleId="BodyTextChar" w:type="character">
     <w:name w:val="Body Text Char"/>

</xml_diff>